<commit_message>
3 rows and 4 cols working
</commit_message>
<xml_diff>
--- a/SRD - Chakali Machine.docx
+++ b/SRD - Chakali Machine.docx
@@ -261,16 +261,7 @@
           </w:tcPr>
           <w:p>
             <w:r>
-              <w:t>G100</w:t>
-            </w:r>
-            <w:r>
-              <w:t>4</w:t>
-            </w:r>
-            <w:r>
-              <w:t xml:space="preserve"> &amp; G100</w:t>
-            </w:r>
-            <w:r>
-              <w:t>5</w:t>
+              <w:t>G1004 &amp; G1005</w:t>
             </w:r>
           </w:p>
         </w:tc>
@@ -283,10 +274,7 @@
               <w:cnfStyle w:val="000000100000" w:firstRow="0" w:lastRow="0" w:firstColumn="0" w:lastColumn="0" w:oddVBand="0" w:evenVBand="0" w:oddHBand="1" w:evenHBand="0" w:firstRowFirstColumn="0" w:firstRowLastColumn="0" w:lastRowFirstColumn="0" w:lastRowLastColumn="0"/>
             </w:pPr>
             <w:r>
-              <w:t>Spiral / Cricle (CW &amp; CCW)</w:t>
-            </w:r>
-            <w:r>
-              <w:t xml:space="preserve"> with table planning</w:t>
+              <w:t>Spiral / Cricle (CW &amp; CCW) with table planning</w:t>
             </w:r>
           </w:p>
         </w:tc>
@@ -450,10 +438,7 @@
         <w:t xml:space="preserve"> &amp; </w:t>
       </w:r>
       <w:r>
-        <w:t>G</w:t>
-      </w:r>
-      <w:r>
-        <w:t>100</w:t>
+        <w:t>G100</w:t>
       </w:r>
       <w:r>
         <w:t xml:space="preserve">3 </w:t>
@@ -673,13 +658,7 @@
       </w:pPr>
       <w:r>
         <w:lastRenderedPageBreak/>
-        <w:t xml:space="preserve">Draw arcs in 90 </w:t>
-      </w:r>
-      <w:r>
-        <w:t>degrees</w:t>
-      </w:r>
-      <w:r>
-        <w:t xml:space="preserve"> of incremental</w:t>
+        <w:t>Draw arcs in 90 degrees of incremental</w:t>
       </w:r>
     </w:p>
     <w:p>
@@ -775,7 +754,13 @@
         <w:ind w:left="720"/>
       </w:pPr>
       <w:r>
-        <w:t>C shall be from 0.0sec to 1.0sec (0 - 1000ms), default to 0</w:t>
+        <w:t xml:space="preserve">C shall be from 0.0sec to 1.0sec (0 - 1000ms), default to </w:t>
+      </w:r>
+      <w:r>
+        <w:t>70</w:t>
+      </w:r>
+      <w:r>
+        <w:t>0</w:t>
       </w:r>
     </w:p>
     <w:p>
@@ -859,7 +844,13 @@
         </w:numPr>
       </w:pPr>
       <w:r>
-        <w:t>Step = S + H</w:t>
+        <w:t>Step</w:t>
+      </w:r>
+      <w:r>
+        <w:t xml:space="preserve"> Size</w:t>
+      </w:r>
+      <w:r>
+        <w:t xml:space="preserve"> = S + H</w:t>
       </w:r>
     </w:p>
     <w:p>
@@ -870,7 +861,13 @@
         </w:numPr>
       </w:pPr>
       <w:r>
-        <w:t>Spiral Size = R + (round(P) * Step)</w:t>
+        <w:t>Spiral Size = R + (round(P) * Step</w:t>
+      </w:r>
+      <w:r>
+        <w:t xml:space="preserve"> Size</w:t>
+      </w:r>
+      <w:r>
+        <w:t>)</w:t>
       </w:r>
     </w:p>
     <w:p>
@@ -878,6 +875,9 @@
         <w:jc w:val="center"/>
       </w:pPr>
       <w:r>
+        <w:rPr>
+          <w:noProof/>
+        </w:rPr>
         <w:drawing>
           <wp:inline distT="0" distB="0" distL="0" distR="0" wp14:anchorId="6F6B2B93" wp14:editId="2CBF9057">
             <wp:extent cx="4820983" cy="2775005"/>
@@ -939,6 +939,9 @@
         <w:jc w:val="center"/>
       </w:pPr>
       <w:r>
+        <w:rPr>
+          <w:noProof/>
+        </w:rPr>
         <w:drawing>
           <wp:inline distT="0" distB="0" distL="0" distR="0" wp14:anchorId="7D73967E" wp14:editId="3E716D31">
             <wp:extent cx="3876675" cy="3238500"/>
@@ -1060,10 +1063,7 @@
         <w:t>G</w:t>
       </w:r>
       <w:r>
-        <w:t>100</w:t>
-      </w:r>
-      <w:r>
-        <w:t>7-</w:t>
+        <w:t>1007-</w:t>
       </w:r>
       <w:r>
         <w:t xml:space="preserve"> </w:t>
@@ -4342,6 +4342,7 @@
   <w:style w:type="character" w:default="1" w:styleId="DefaultParagraphFont">
     <w:name w:val="Default Paragraph Font"/>
     <w:uiPriority w:val="1"/>
+    <w:semiHidden/>
     <w:unhideWhenUsed/>
   </w:style>
   <w:style w:type="table" w:default="1" w:styleId="TableNormal">
@@ -5166,8 +5167,11 @@
   <w:rsids>
     <w:rsidRoot w:val="00316D58"/>
     <w:rsid w:val="00316D58"/>
+    <w:rsid w:val="005A64FC"/>
     <w:rsid w:val="00A46174"/>
+    <w:rsid w:val="00DD25B7"/>
     <w:rsid w:val="00E43BB5"/>
+    <w:rsid w:val="00F51573"/>
   </w:rsids>
   <m:mathPr>
     <m:mathFont m:val="Cambria Math"/>
@@ -5602,7 +5606,6 @@
     <w:uiPriority w:val="1"/>
     <w:semiHidden/>
     <w:unhideWhenUsed/>
-    <w:rsid w:val="00316D58"/>
   </w:style>
   <w:style w:type="table" w:default="1" w:styleId="TableNormal">
     <w:name w:val="Normal Table"/>

</xml_diff>

<commit_message>
pins defined and used in code. SD card interface
</commit_message>
<xml_diff>
--- a/SRD - Chakali Machine.docx
+++ b/SRD - Chakali Machine.docx
@@ -690,7 +690,19 @@
         <w:ind w:left="720"/>
       </w:pPr>
       <w:r>
-        <w:t>F shall be from 10mm/sec to 100mm/sec (600 - 6000mm/min), default to 25 (1500)</w:t>
+        <w:t xml:space="preserve">F shall be from 10mm/sec to 100mm/sec (600 - 6000mm/min), default to </w:t>
+      </w:r>
+      <w:r>
+        <w:t>30</w:t>
+      </w:r>
+      <w:r>
+        <w:t xml:space="preserve"> (</w:t>
+      </w:r>
+      <w:r>
+        <w:t>3000</w:t>
+      </w:r>
+      <w:r>
+        <w:t>)</w:t>
       </w:r>
     </w:p>
     <w:p>
@@ -5168,7 +5180,9 @@
     <w:rsidRoot w:val="00316D58"/>
     <w:rsid w:val="00316D58"/>
     <w:rsid w:val="005A64FC"/>
+    <w:rsid w:val="00A1692C"/>
     <w:rsid w:val="00A46174"/>
+    <w:rsid w:val="00D461B8"/>
     <w:rsid w:val="00DD25B7"/>
     <w:rsid w:val="00E43BB5"/>
     <w:rsid w:val="00F51573"/>

</xml_diff>